<commit_message>
feat: restyle slide deck to reference concept-card style (v47), LG v6.4
- Deck v47: concept slides rebuilt as chevron flows, outlined cards, two-panel
  comparisons, data tables and takeaway bands (reference-deck style); one visual
  lab slide per activity (workflow chevron + n8n screenshot + website screenshot)
- Removed all one-step-per-slide runs — click-by-click steps live in the Learner Guide
- New concepts: trigger nodes + trigger→lab table, data-processing nodes, webhook
  GET vs POST + Test vs Production URL, AI agent anatomy, good vs bad instructions,
  model parameters (temperature), MCP, human in/on/out of the loop, guardrails
- Fixed Activity 8a/8b numbering to match LG/LP (8a=HITL approval, 8b=dashboard)
- LG v6.4: webhook GET/POST + Test/Production URL concepts; PDF exported with built TOC
- Skills updated to encode the new style; gitignore reference/ source material

Co-Authored-By: Claude Fable 5 <noreply@anthropic.com>
</commit_message>
<xml_diff>
--- a/courseware/LG-Agentic AI Automation with n8n.docx
+++ b/courseware/LG-Agentic AI Automation with n8n.docx
@@ -218,7 +218,7 @@
           <w:color w:val="1F6FEB"/>
           <w:sz w:val="24"/>
         </w:rPr>
-        <w:t>Version 6.3</w:t>
+        <w:t>Version 6.4</w:t>
       </w:r>
     </w:p>
     <w:p>
@@ -844,6 +844,64 @@
           </w:p>
         </w:tc>
       </w:tr>
+      <w:tr>
+        <w:tc>
+          <w:tcPr>
+            <w:tcW w:type="dxa" w:w="2160"/>
+          </w:tcPr>
+          <w:p>
+            <w:r/>
+            <w:r>
+              <w:rPr>
+                <w:sz w:val="19"/>
+              </w:rPr>
+              <w:t>6.4</w:t>
+            </w:r>
+          </w:p>
+        </w:tc>
+        <w:tc>
+          <w:tcPr>
+            <w:tcW w:type="dxa" w:w="2160"/>
+          </w:tcPr>
+          <w:p>
+            <w:r/>
+            <w:r>
+              <w:rPr>
+                <w:sz w:val="19"/>
+              </w:rPr>
+              <w:t>8 Aug 2026</w:t>
+            </w:r>
+          </w:p>
+        </w:tc>
+        <w:tc>
+          <w:tcPr>
+            <w:tcW w:type="dxa" w:w="2160"/>
+          </w:tcPr>
+          <w:p>
+            <w:r/>
+            <w:r>
+              <w:rPr>
+                <w:sz w:val="19"/>
+              </w:rPr>
+              <w:t>Aligned with slide deck v47 (restyled concept-card deck): the Learner Guide remains the single step-by-step source for all labs; expanded the Activity 5 webhook concepts with GET vs POST and the Test URL vs Production URL rule</w:t>
+            </w:r>
+          </w:p>
+        </w:tc>
+        <w:tc>
+          <w:tcPr>
+            <w:tcW w:type="dxa" w:w="2160"/>
+          </w:tcPr>
+          <w:p>
+            <w:r/>
+            <w:r>
+              <w:rPr>
+                <w:sz w:val="19"/>
+              </w:rPr>
+              <w:t>Tertiary Infotech Academy Pte Ltd</w:t>
+            </w:r>
+          </w:p>
+        </w:tc>
+      </w:tr>
     </w:tbl>
     <w:p>
       <w:r>
@@ -4301,6 +4359,101 @@
         <w:pStyle w:val="ListBullet"/>
       </w:pPr>
       <w:r>
+        <w:rPr>
+          <w:b/>
+        </w:rPr>
+        <w:t>GET vs POST:</w:t>
+      </w:r>
+      <w:r>
+        <w:t xml:space="preserve"> GET carries data in the URL query string (read it as </w:t>
+      </w:r>
+      <w:r>
+        <w:rPr>
+          <w:rFonts w:ascii="Consolas" w:hAnsi="Consolas"/>
+          <w:color w:val="C7254E"/>
+        </w:rPr>
+        <w:t>{{ $json.query.field }}</w:t>
+      </w:r>
+      <w:r>
+        <w:t xml:space="preserve">); POST carries a JSON body (read it as </w:t>
+      </w:r>
+      <w:r>
+        <w:rPr>
+          <w:rFonts w:ascii="Consolas" w:hAnsi="Consolas"/>
+          <w:color w:val="C7254E"/>
+        </w:rPr>
+        <w:t>{{ $json.body.field }}</w:t>
+      </w:r>
+      <w:r>
+        <w:t>). Website chat and forms POST; the Activity 8b dashboard GETs.</w:t>
+      </w:r>
+    </w:p>
+    <w:p>
+      <w:pPr>
+        <w:pStyle w:val="ListBullet"/>
+      </w:pPr>
+      <w:r>
+        <w:rPr>
+          <w:b/>
+        </w:rPr>
+        <w:t>Test URL vs Production URL:</w:t>
+      </w:r>
+      <w:r>
+        <w:t xml:space="preserve"> the Test URL (</w:t>
+      </w:r>
+      <w:r>
+        <w:rPr>
+          <w:rFonts w:ascii="Consolas" w:hAnsi="Consolas"/>
+          <w:color w:val="C7254E"/>
+        </w:rPr>
+        <w:t>/webhook-test/…</w:t>
+      </w:r>
+      <w:r>
+        <w:t>) listens for ONE call while you click *Listen for test event* and shows the run live on the canvas; the Production URL (</w:t>
+      </w:r>
+      <w:r>
+        <w:rPr>
+          <w:rFonts w:ascii="Consolas" w:hAnsi="Consolas"/>
+          <w:color w:val="C7254E"/>
+        </w:rPr>
+        <w:t>/webhook/…</w:t>
+      </w:r>
+      <w:r>
+        <w:t xml:space="preserve">) requires the workflow to be </w:t>
+      </w:r>
+      <w:r>
+        <w:rPr>
+          <w:b/>
+        </w:rPr>
+        <w:t>Active</w:t>
+      </w:r>
+      <w:r>
+        <w:t xml:space="preserve">, is always on, and logs runs in the </w:t>
+      </w:r>
+      <w:r>
+        <w:rPr>
+          <w:b/>
+        </w:rPr>
+        <w:t>Executions</w:t>
+      </w:r>
+      <w:r>
+        <w:t xml:space="preserve"> list. Websites must always call the </w:t>
+      </w:r>
+      <w:r>
+        <w:rPr>
+          <w:b/>
+        </w:rPr>
+        <w:t>Production URL</w:t>
+      </w:r>
+      <w:r>
+        <w:t xml:space="preserve"> of an Active workflow.</w:t>
+      </w:r>
+    </w:p>
+    <w:p>
+      <w:pPr>
+        <w:pStyle w:val="ListBullet"/>
+      </w:pPr>
+      <w:r>
         <w:t xml:space="preserve">Pair the Webhook trigger with a </w:t>
       </w:r>
       <w:r>
@@ -4488,7 +4641,7 @@
       <w:r>
         <w:drawing>
           <wp:inline xmlns:a="http://schemas.openxmlformats.org/drawingml/2006/main" xmlns:pic="http://schemas.openxmlformats.org/drawingml/2006/picture">
-            <wp:extent cx="5669280" cy="3297631"/>
+            <wp:extent cx="5669280" cy="3543300"/>
             <wp:docPr id="10" name="Picture 10"/>
             <wp:cNvGraphicFramePr>
               <a:graphicFrameLocks noChangeAspect="1"/>
@@ -4509,7 +4662,7 @@
                   <pic:spPr>
                     <a:xfrm>
                       <a:off x="0" y="0"/>
-                      <a:ext cx="5669280" cy="3297631"/>
+                      <a:ext cx="5669280" cy="3543300"/>
                     </a:xfrm>
                     <a:prstGeom prst="rect"/>
                   </pic:spPr>

</xml_diff>